<commit_message>
perf: add single-kernel image reduction v04
</commit_message>
<xml_diff>
--- a/document/CUDA图像渐变融合开发优化流程报告.docx
+++ b/document/CUDA图像渐变融合开发优化流程报告.docx
@@ -43,8 +43,6 @@
         </w:rPr>
         <w:t>3</w:t>
       </w:r>
-      <w:bookmarkStart w:id="0" w:name="_GoBack"/>
-      <w:bookmarkEnd w:id="0"/>
     </w:p>
     <w:p>
       <w:pPr>
@@ -1002,6 +1000,619 @@
         <w:t>内存，也需要耗费一定的时间，整体效率的提升并不大。</w:t>
       </w:r>
     </w:p>
+    <w:p>
+      <w:pPr>
+        <w:spacing w:after="120"/>
+      </w:pPr>
+    </w:p>
+    <w:p>
+      <w:pPr>
+        <w:spacing w:after="120"/>
+      </w:pPr>
+    </w:p>
+    <w:p>
+      <w:pPr>
+        <w:spacing w:after="120"/>
+        <w:rPr>
+          <w:rFonts w:hint="eastAsia"/>
+          <w:b/>
+          <w:sz w:val="26"/>
+          <w:lang w:val="en-US" w:eastAsia="zh-CN"/>
+        </w:rPr>
+      </w:pPr>
+      <w:r>
+        <w:rPr>
+          <w:rFonts w:hint="eastAsia"/>
+          <w:b/>
+          <w:sz w:val="26"/>
+          <w:lang w:val="en-US" w:eastAsia="zh-CN"/>
+        </w:rPr>
+        <w:t>实现4</w:t>
+      </w:r>
+    </w:p>
+    <w:p>
+      <w:pPr>
+        <w:spacing w:after="120"/>
+        <w:rPr>
+          <w:rFonts w:hint="default"/>
+          <w:lang w:val="en-US" w:eastAsia="zh-CN"/>
+        </w:rPr>
+      </w:pPr>
+      <w:r>
+        <w:rPr>
+          <w:rFonts w:hint="eastAsia"/>
+          <w:lang w:val="en-US" w:eastAsia="zh-CN"/>
+        </w:rPr>
+        <w:t>将所有图像传输到连续的显存中，把逐层融合的迭代放入单个核函数中，在单个核函数内部实现多轮图像融合与内存复用。</w:t>
+      </w:r>
+    </w:p>
+    <w:p>
+      <w:pPr>
+        <w:spacing w:after="120"/>
+        <w:ind w:left="360"/>
+        <w:rPr>
+          <w:rFonts w:hint="eastAsia" w:ascii="Consolas" w:hAnsi="Consolas" w:eastAsia="Consolas"/>
+          <w:sz w:val="18"/>
+        </w:rPr>
+      </w:pPr>
+      <w:r>
+        <w:rPr>
+          <w:rFonts w:hint="eastAsia" w:ascii="Consolas" w:hAnsi="Consolas" w:eastAsia="Consolas"/>
+          <w:sz w:val="18"/>
+        </w:rPr>
+        <w:t>__global__ void blendImageIter(unsigned char* images, size_t imageSize, size_t imageNum)</w:t>
+      </w:r>
+    </w:p>
+    <w:p>
+      <w:pPr>
+        <w:spacing w:after="120"/>
+        <w:ind w:left="360"/>
+        <w:rPr>
+          <w:rFonts w:hint="eastAsia" w:ascii="Consolas" w:hAnsi="Consolas" w:eastAsia="Consolas"/>
+          <w:sz w:val="18"/>
+        </w:rPr>
+      </w:pPr>
+      <w:r>
+        <w:rPr>
+          <w:rFonts w:hint="eastAsia" w:ascii="Consolas" w:hAnsi="Consolas" w:eastAsia="Consolas"/>
+          <w:sz w:val="18"/>
+        </w:rPr>
+        <w:t>{</w:t>
+      </w:r>
+    </w:p>
+    <w:p>
+      <w:pPr>
+        <w:spacing w:after="120"/>
+        <w:ind w:left="360"/>
+        <w:rPr>
+          <w:rFonts w:hint="eastAsia" w:ascii="Consolas" w:hAnsi="Consolas" w:eastAsia="Consolas"/>
+          <w:sz w:val="18"/>
+        </w:rPr>
+      </w:pPr>
+      <w:r>
+        <w:rPr>
+          <w:rFonts w:hint="eastAsia" w:ascii="Consolas" w:hAnsi="Consolas" w:eastAsia="Consolas"/>
+          <w:sz w:val="18"/>
+        </w:rPr>
+        <w:tab/>
+      </w:r>
+      <w:r>
+        <w:rPr>
+          <w:rFonts w:hint="eastAsia" w:ascii="Consolas" w:hAnsi="Consolas" w:eastAsia="Consolas"/>
+          <w:sz w:val="18"/>
+        </w:rPr>
+        <w:t>const size_t index = static_cast&lt;size_t&gt;(blockIdx.x) * blockDim.x + threadIdx.x;</w:t>
+      </w:r>
+    </w:p>
+    <w:p>
+      <w:pPr>
+        <w:spacing w:after="120"/>
+        <w:ind w:left="360"/>
+        <w:rPr>
+          <w:rFonts w:hint="eastAsia" w:ascii="Consolas" w:hAnsi="Consolas" w:eastAsia="Consolas"/>
+          <w:sz w:val="18"/>
+        </w:rPr>
+      </w:pPr>
+      <w:r>
+        <w:rPr>
+          <w:rFonts w:hint="eastAsia" w:ascii="Consolas" w:hAnsi="Consolas" w:eastAsia="Consolas"/>
+          <w:sz w:val="18"/>
+        </w:rPr>
+        <w:tab/>
+      </w:r>
+      <w:r>
+        <w:rPr>
+          <w:rFonts w:hint="eastAsia" w:ascii="Consolas" w:hAnsi="Consolas" w:eastAsia="Consolas"/>
+          <w:sz w:val="18"/>
+        </w:rPr>
+        <w:t>if (index &gt;= imageSize)</w:t>
+      </w:r>
+    </w:p>
+    <w:p>
+      <w:pPr>
+        <w:spacing w:after="120"/>
+        <w:ind w:left="360"/>
+        <w:rPr>
+          <w:rFonts w:hint="eastAsia" w:ascii="Consolas" w:hAnsi="Consolas" w:eastAsia="Consolas"/>
+          <w:sz w:val="18"/>
+        </w:rPr>
+      </w:pPr>
+      <w:r>
+        <w:rPr>
+          <w:rFonts w:hint="eastAsia" w:ascii="Consolas" w:hAnsi="Consolas" w:eastAsia="Consolas"/>
+          <w:sz w:val="18"/>
+        </w:rPr>
+        <w:tab/>
+      </w:r>
+      <w:r>
+        <w:rPr>
+          <w:rFonts w:hint="eastAsia" w:ascii="Consolas" w:hAnsi="Consolas" w:eastAsia="Consolas"/>
+          <w:sz w:val="18"/>
+        </w:rPr>
+        <w:tab/>
+      </w:r>
+      <w:r>
+        <w:rPr>
+          <w:rFonts w:hint="eastAsia" w:ascii="Consolas" w:hAnsi="Consolas" w:eastAsia="Consolas"/>
+          <w:sz w:val="18"/>
+        </w:rPr>
+        <w:t>return;</w:t>
+      </w:r>
+    </w:p>
+    <w:p>
+      <w:pPr>
+        <w:spacing w:after="120"/>
+        <w:ind w:left="360"/>
+        <w:rPr>
+          <w:rFonts w:hint="eastAsia" w:ascii="Consolas" w:hAnsi="Consolas" w:eastAsia="Consolas"/>
+          <w:sz w:val="18"/>
+        </w:rPr>
+      </w:pPr>
+    </w:p>
+    <w:p>
+      <w:pPr>
+        <w:spacing w:after="120"/>
+        <w:ind w:left="360"/>
+        <w:rPr>
+          <w:rFonts w:hint="eastAsia" w:ascii="Consolas" w:hAnsi="Consolas" w:eastAsia="Consolas"/>
+          <w:sz w:val="18"/>
+        </w:rPr>
+      </w:pPr>
+      <w:r>
+        <w:rPr>
+          <w:rFonts w:hint="eastAsia" w:ascii="Consolas" w:hAnsi="Consolas" w:eastAsia="Consolas"/>
+          <w:sz w:val="18"/>
+        </w:rPr>
+        <w:tab/>
+      </w:r>
+      <w:r>
+        <w:rPr>
+          <w:rFonts w:hint="eastAsia" w:ascii="Consolas" w:hAnsi="Consolas" w:eastAsia="Consolas"/>
+          <w:sz w:val="18"/>
+        </w:rPr>
+        <w:t>for (size_t pairDistance = 1; pairDistance &lt; imageNum; pairDistance &lt;&lt;= 1) {</w:t>
+      </w:r>
+    </w:p>
+    <w:p>
+      <w:pPr>
+        <w:spacing w:after="120"/>
+        <w:ind w:left="360"/>
+        <w:rPr>
+          <w:rFonts w:hint="eastAsia" w:ascii="Consolas" w:hAnsi="Consolas" w:eastAsia="Consolas"/>
+          <w:sz w:val="18"/>
+        </w:rPr>
+      </w:pPr>
+      <w:r>
+        <w:rPr>
+          <w:rFonts w:hint="eastAsia" w:ascii="Consolas" w:hAnsi="Consolas" w:eastAsia="Consolas"/>
+          <w:sz w:val="18"/>
+        </w:rPr>
+        <w:tab/>
+      </w:r>
+      <w:r>
+        <w:rPr>
+          <w:rFonts w:hint="eastAsia" w:ascii="Consolas" w:hAnsi="Consolas" w:eastAsia="Consolas"/>
+          <w:sz w:val="18"/>
+        </w:rPr>
+        <w:tab/>
+      </w:r>
+      <w:r>
+        <w:rPr>
+          <w:rFonts w:hint="eastAsia" w:ascii="Consolas" w:hAnsi="Consolas" w:eastAsia="Consolas"/>
+          <w:sz w:val="18"/>
+        </w:rPr>
+        <w:t>const size_t groupSize = pairDistance &lt;&lt; 1;</w:t>
+      </w:r>
+    </w:p>
+    <w:p>
+      <w:pPr>
+        <w:spacing w:after="120"/>
+        <w:ind w:left="360"/>
+        <w:rPr>
+          <w:rFonts w:hint="eastAsia" w:ascii="Consolas" w:hAnsi="Consolas" w:eastAsia="Consolas"/>
+          <w:sz w:val="18"/>
+        </w:rPr>
+      </w:pPr>
+      <w:r>
+        <w:rPr>
+          <w:rFonts w:hint="eastAsia" w:ascii="Consolas" w:hAnsi="Consolas" w:eastAsia="Consolas"/>
+          <w:sz w:val="18"/>
+        </w:rPr>
+        <w:tab/>
+      </w:r>
+      <w:r>
+        <w:rPr>
+          <w:rFonts w:hint="eastAsia" w:ascii="Consolas" w:hAnsi="Consolas" w:eastAsia="Consolas"/>
+          <w:sz w:val="18"/>
+        </w:rPr>
+        <w:tab/>
+      </w:r>
+      <w:r>
+        <w:rPr>
+          <w:rFonts w:hint="eastAsia" w:ascii="Consolas" w:hAnsi="Consolas" w:eastAsia="Consolas"/>
+          <w:sz w:val="18"/>
+        </w:rPr>
+        <w:t>for (size_t leftImage = 0; leftImage &lt; imageNum; leftImage += groupSize) {</w:t>
+      </w:r>
+    </w:p>
+    <w:p>
+      <w:pPr>
+        <w:spacing w:after="120"/>
+        <w:ind w:left="360"/>
+        <w:rPr>
+          <w:rFonts w:hint="eastAsia" w:ascii="Consolas" w:hAnsi="Consolas" w:eastAsia="Consolas"/>
+          <w:sz w:val="18"/>
+        </w:rPr>
+      </w:pPr>
+      <w:r>
+        <w:rPr>
+          <w:rFonts w:hint="eastAsia" w:ascii="Consolas" w:hAnsi="Consolas" w:eastAsia="Consolas"/>
+          <w:sz w:val="18"/>
+        </w:rPr>
+        <w:tab/>
+      </w:r>
+      <w:r>
+        <w:rPr>
+          <w:rFonts w:hint="eastAsia" w:ascii="Consolas" w:hAnsi="Consolas" w:eastAsia="Consolas"/>
+          <w:sz w:val="18"/>
+        </w:rPr>
+        <w:tab/>
+      </w:r>
+      <w:r>
+        <w:rPr>
+          <w:rFonts w:hint="eastAsia" w:ascii="Consolas" w:hAnsi="Consolas" w:eastAsia="Consolas"/>
+          <w:sz w:val="18"/>
+        </w:rPr>
+        <w:tab/>
+      </w:r>
+      <w:r>
+        <w:rPr>
+          <w:rFonts w:hint="eastAsia" w:ascii="Consolas" w:hAnsi="Consolas" w:eastAsia="Consolas"/>
+          <w:sz w:val="18"/>
+        </w:rPr>
+        <w:t>const size_t leftOffset = leftImage * imageSize + index;</w:t>
+      </w:r>
+    </w:p>
+    <w:p>
+      <w:pPr>
+        <w:spacing w:after="120"/>
+        <w:ind w:left="360"/>
+        <w:rPr>
+          <w:rFonts w:hint="eastAsia" w:ascii="Consolas" w:hAnsi="Consolas" w:eastAsia="Consolas"/>
+          <w:sz w:val="18"/>
+        </w:rPr>
+      </w:pPr>
+      <w:r>
+        <w:rPr>
+          <w:rFonts w:hint="eastAsia" w:ascii="Consolas" w:hAnsi="Consolas" w:eastAsia="Consolas"/>
+          <w:sz w:val="18"/>
+        </w:rPr>
+        <w:tab/>
+      </w:r>
+      <w:r>
+        <w:rPr>
+          <w:rFonts w:hint="eastAsia" w:ascii="Consolas" w:hAnsi="Consolas" w:eastAsia="Consolas"/>
+          <w:sz w:val="18"/>
+        </w:rPr>
+        <w:tab/>
+      </w:r>
+      <w:r>
+        <w:rPr>
+          <w:rFonts w:hint="eastAsia" w:ascii="Consolas" w:hAnsi="Consolas" w:eastAsia="Consolas"/>
+          <w:sz w:val="18"/>
+        </w:rPr>
+        <w:tab/>
+      </w:r>
+      <w:r>
+        <w:rPr>
+          <w:rFonts w:hint="eastAsia" w:ascii="Consolas" w:hAnsi="Consolas" w:eastAsia="Consolas"/>
+          <w:sz w:val="18"/>
+        </w:rPr>
+        <w:t>const size_t rightOffset = (leftImage + pairDistance) * imageSize + index;</w:t>
+      </w:r>
+    </w:p>
+    <w:p>
+      <w:pPr>
+        <w:spacing w:after="120"/>
+        <w:ind w:left="360"/>
+        <w:rPr>
+          <w:rFonts w:hint="eastAsia" w:ascii="Consolas" w:hAnsi="Consolas" w:eastAsia="Consolas"/>
+          <w:sz w:val="18"/>
+        </w:rPr>
+      </w:pPr>
+      <w:r>
+        <w:rPr>
+          <w:rFonts w:hint="eastAsia" w:ascii="Consolas" w:hAnsi="Consolas" w:eastAsia="Consolas"/>
+          <w:sz w:val="18"/>
+        </w:rPr>
+        <w:tab/>
+      </w:r>
+      <w:r>
+        <w:rPr>
+          <w:rFonts w:hint="eastAsia" w:ascii="Consolas" w:hAnsi="Consolas" w:eastAsia="Consolas"/>
+          <w:sz w:val="18"/>
+        </w:rPr>
+        <w:tab/>
+      </w:r>
+      <w:r>
+        <w:rPr>
+          <w:rFonts w:hint="eastAsia" w:ascii="Consolas" w:hAnsi="Consolas" w:eastAsia="Consolas"/>
+          <w:sz w:val="18"/>
+        </w:rPr>
+        <w:tab/>
+      </w:r>
+      <w:r>
+        <w:rPr>
+          <w:rFonts w:hint="eastAsia" w:ascii="Consolas" w:hAnsi="Consolas" w:eastAsia="Consolas"/>
+          <w:sz w:val="18"/>
+        </w:rPr>
+        <w:t>images[leftOffset] = static_cast&lt;unsigned char&gt;(</w:t>
+      </w:r>
+    </w:p>
+    <w:p>
+      <w:pPr>
+        <w:spacing w:after="120"/>
+        <w:ind w:left="360"/>
+        <w:rPr>
+          <w:rFonts w:hint="eastAsia" w:ascii="Consolas" w:hAnsi="Consolas" w:eastAsia="Consolas"/>
+          <w:sz w:val="18"/>
+        </w:rPr>
+      </w:pPr>
+      <w:r>
+        <w:rPr>
+          <w:rFonts w:hint="eastAsia" w:ascii="Consolas" w:hAnsi="Consolas" w:eastAsia="Consolas"/>
+          <w:sz w:val="18"/>
+        </w:rPr>
+        <w:tab/>
+      </w:r>
+      <w:r>
+        <w:rPr>
+          <w:rFonts w:hint="eastAsia" w:ascii="Consolas" w:hAnsi="Consolas" w:eastAsia="Consolas"/>
+          <w:sz w:val="18"/>
+        </w:rPr>
+        <w:tab/>
+      </w:r>
+      <w:r>
+        <w:rPr>
+          <w:rFonts w:hint="eastAsia" w:ascii="Consolas" w:hAnsi="Consolas" w:eastAsia="Consolas"/>
+          <w:sz w:val="18"/>
+        </w:rPr>
+        <w:tab/>
+      </w:r>
+      <w:r>
+        <w:rPr>
+          <w:rFonts w:hint="eastAsia" w:ascii="Consolas" w:hAnsi="Consolas" w:eastAsia="Consolas"/>
+          <w:sz w:val="18"/>
+        </w:rPr>
+        <w:tab/>
+      </w:r>
+      <w:r>
+        <w:rPr>
+          <w:rFonts w:hint="eastAsia" w:ascii="Consolas" w:hAnsi="Consolas" w:eastAsia="Consolas"/>
+          <w:sz w:val="18"/>
+        </w:rPr>
+        <w:t>(images[leftOffset] + images[rightOffset]) / 2);</w:t>
+      </w:r>
+    </w:p>
+    <w:p>
+      <w:pPr>
+        <w:spacing w:after="120"/>
+        <w:ind w:left="360"/>
+        <w:rPr>
+          <w:rFonts w:hint="eastAsia" w:ascii="Consolas" w:hAnsi="Consolas" w:eastAsia="Consolas"/>
+          <w:sz w:val="18"/>
+        </w:rPr>
+      </w:pPr>
+      <w:r>
+        <w:rPr>
+          <w:rFonts w:hint="eastAsia" w:ascii="Consolas" w:hAnsi="Consolas" w:eastAsia="Consolas"/>
+          <w:sz w:val="18"/>
+        </w:rPr>
+        <w:tab/>
+      </w:r>
+      <w:r>
+        <w:rPr>
+          <w:rFonts w:hint="eastAsia" w:ascii="Consolas" w:hAnsi="Consolas" w:eastAsia="Consolas"/>
+          <w:sz w:val="18"/>
+        </w:rPr>
+        <w:tab/>
+      </w:r>
+      <w:r>
+        <w:rPr>
+          <w:rFonts w:hint="eastAsia" w:ascii="Consolas" w:hAnsi="Consolas" w:eastAsia="Consolas"/>
+          <w:sz w:val="18"/>
+        </w:rPr>
+        <w:t>}</w:t>
+      </w:r>
+    </w:p>
+    <w:p>
+      <w:pPr>
+        <w:spacing w:after="120"/>
+        <w:ind w:left="360"/>
+        <w:rPr>
+          <w:rFonts w:hint="eastAsia" w:ascii="Consolas" w:hAnsi="Consolas" w:eastAsia="Consolas"/>
+          <w:sz w:val="18"/>
+        </w:rPr>
+      </w:pPr>
+      <w:r>
+        <w:rPr>
+          <w:rFonts w:hint="eastAsia" w:ascii="Consolas" w:hAnsi="Consolas" w:eastAsia="Consolas"/>
+          <w:sz w:val="18"/>
+        </w:rPr>
+        <w:tab/>
+      </w:r>
+      <w:r>
+        <w:rPr>
+          <w:rFonts w:hint="eastAsia" w:ascii="Consolas" w:hAnsi="Consolas" w:eastAsia="Consolas"/>
+          <w:sz w:val="18"/>
+        </w:rPr>
+        <w:t>}</w:t>
+      </w:r>
+    </w:p>
+    <w:p>
+      <w:pPr>
+        <w:spacing w:after="120"/>
+        <w:ind w:left="360"/>
+        <w:rPr>
+          <w:rFonts w:hint="eastAsia" w:ascii="Consolas" w:hAnsi="Consolas" w:eastAsia="Consolas"/>
+          <w:sz w:val="18"/>
+          <w:lang w:val="en-US" w:eastAsia="zh-CN"/>
+        </w:rPr>
+      </w:pPr>
+      <w:r>
+        <w:rPr>
+          <w:rFonts w:hint="eastAsia" w:ascii="Consolas" w:hAnsi="Consolas" w:eastAsia="Consolas"/>
+          <w:sz w:val="18"/>
+        </w:rPr>
+        <w:t>}</w:t>
+      </w:r>
+    </w:p>
+    <w:p>
+      <w:pPr>
+        <w:spacing w:after="120"/>
+        <w:rPr>
+          <w:rFonts w:hint="eastAsia"/>
+          <w:b/>
+          <w:sz w:val="26"/>
+          <w:lang w:val="en-US" w:eastAsia="zh-CN"/>
+        </w:rPr>
+      </w:pPr>
+      <w:r>
+        <w:rPr>
+          <w:rFonts w:hint="eastAsia"/>
+          <w:b/>
+          <w:sz w:val="26"/>
+          <w:lang w:val="en-US" w:eastAsia="zh-CN"/>
+        </w:rPr>
+        <w:t>测试结果：</w:t>
+      </w:r>
+    </w:p>
+    <w:p>
+      <w:pPr>
+        <w:spacing w:after="120"/>
+      </w:pPr>
+      <w:r>
+        <w:drawing>
+          <wp:inline distT="0" distB="0" distL="114300" distR="114300">
+            <wp:extent cx="4191635" cy="2909570"/>
+            <wp:effectExtent l="0" t="0" r="12065" b="11430"/>
+            <wp:docPr id="4" name="图片 1"/>
+            <wp:cNvGraphicFramePr>
+              <a:graphicFrameLocks xmlns:a="http://schemas.openxmlformats.org/drawingml/2006/main" noChangeAspect="1"/>
+            </wp:cNvGraphicFramePr>
+            <a:graphic xmlns:a="http://schemas.openxmlformats.org/drawingml/2006/main">
+              <a:graphicData uri="http://schemas.openxmlformats.org/drawingml/2006/picture">
+                <pic:pic xmlns:pic="http://schemas.openxmlformats.org/drawingml/2006/picture">
+                  <pic:nvPicPr>
+                    <pic:cNvPr id="4" name="图片 1"/>
+                    <pic:cNvPicPr>
+                      <a:picLocks noChangeAspect="1"/>
+                    </pic:cNvPicPr>
+                  </pic:nvPicPr>
+                  <pic:blipFill>
+                    <a:blip r:embed="rId9"/>
+                    <a:stretch>
+                      <a:fillRect/>
+                    </a:stretch>
+                  </pic:blipFill>
+                  <pic:spPr>
+                    <a:xfrm>
+                      <a:off x="0" y="0"/>
+                      <a:ext cx="4191635" cy="2909570"/>
+                    </a:xfrm>
+                    <a:prstGeom prst="rect">
+                      <a:avLst/>
+                    </a:prstGeom>
+                    <a:noFill/>
+                    <a:ln>
+                      <a:noFill/>
+                    </a:ln>
+                  </pic:spPr>
+                </pic:pic>
+              </a:graphicData>
+            </a:graphic>
+          </wp:inline>
+        </w:drawing>
+      </w:r>
+    </w:p>
+    <w:p>
+      <w:pPr>
+        <w:spacing w:after="120"/>
+        <w:rPr>
+          <w:rFonts w:hint="eastAsia"/>
+          <w:lang w:val="en-US" w:eastAsia="zh-CN"/>
+        </w:rPr>
+      </w:pPr>
+      <w:r>
+        <w:rPr>
+          <w:rFonts w:hint="eastAsia"/>
+          <w:lang w:val="en-US" w:eastAsia="zh-CN"/>
+        </w:rPr>
+        <w:t>后5轮平均数据传输耗时约18.9ms，与实现2耗时18.6ms相近，核函数耗时约1.9ms，较实现2耗时2.4ms速度提升约1.3倍。CPU侧统计平均耗时为 27.5 ms。耗时的降低中，包含对显存的连续申请和分开申请上的速度差异，实现4一次申请16张图像ImageSize的显存，而实现2则是分16次申请释放。</w:t>
+      </w:r>
+    </w:p>
+    <w:p>
+      <w:pPr>
+        <w:spacing w:after="120"/>
+        <w:rPr>
+          <w:rFonts w:hint="eastAsia"/>
+          <w:lang w:val="en-US" w:eastAsia="zh-CN"/>
+        </w:rPr>
+      </w:pPr>
+    </w:p>
+    <w:p>
+      <w:pPr>
+        <w:spacing w:after="120"/>
+        <w:rPr>
+          <w:rFonts w:hint="eastAsia"/>
+          <w:b/>
+          <w:sz w:val="26"/>
+          <w:lang w:val="en-US" w:eastAsia="zh-CN"/>
+        </w:rPr>
+      </w:pPr>
+      <w:r>
+        <w:rPr>
+          <w:rFonts w:hint="eastAsia"/>
+          <w:b/>
+          <w:sz w:val="26"/>
+          <w:lang w:val="en-US" w:eastAsia="zh-CN"/>
+        </w:rPr>
+        <w:t>实现5</w:t>
+      </w:r>
+    </w:p>
+    <w:p>
+      <w:pPr>
+        <w:spacing w:after="120"/>
+        <w:rPr>
+          <w:rFonts w:hint="default"/>
+          <w:b/>
+          <w:sz w:val="26"/>
+          <w:lang w:val="en-US" w:eastAsia="zh-CN"/>
+        </w:rPr>
+      </w:pPr>
+      <w:bookmarkStart w:id="0" w:name="_GoBack"/>
+      <w:bookmarkEnd w:id="0"/>
+    </w:p>
     <w:sectPr>
       <w:pgSz w:w="12240" w:h="15840"/>
       <w:pgMar w:top="1440" w:right="1440" w:bottom="1440" w:left="1440" w:header="720" w:footer="720" w:gutter="0"/>
@@ -1262,8 +1873,8 @@
     <w:lsdException w:uiPriority="99" w:name="Normal Indent"/>
     <w:lsdException w:uiPriority="99" w:name="footnote text"/>
     <w:lsdException w:uiPriority="99" w:name="annotation text"/>
-    <w:lsdException w:uiPriority="99" w:semiHidden="0" w:name="header"/>
-    <w:lsdException w:uiPriority="99" w:semiHidden="0" w:name="footer"/>
+    <w:lsdException w:qFormat="1" w:uiPriority="99" w:semiHidden="0" w:name="header"/>
+    <w:lsdException w:qFormat="1" w:uiPriority="99" w:semiHidden="0" w:name="footer"/>
     <w:lsdException w:uiPriority="99" w:name="index heading"/>
     <w:lsdException w:qFormat="1" w:uiPriority="35" w:name="caption"/>
     <w:lsdException w:uiPriority="99" w:name="table of figures"/>
@@ -1278,14 +1889,14 @@
     <w:lsdException w:uiPriority="99" w:name="table of authorities"/>
     <w:lsdException w:uiPriority="99" w:semiHidden="0" w:name="macro"/>
     <w:lsdException w:uiPriority="99" w:name="toa heading"/>
-    <w:lsdException w:uiPriority="99" w:semiHidden="0" w:name="List"/>
+    <w:lsdException w:qFormat="1" w:uiPriority="99" w:semiHidden="0" w:name="List"/>
     <w:lsdException w:uiPriority="99" w:semiHidden="0" w:name="List Bullet"/>
     <w:lsdException w:uiPriority="99" w:semiHidden="0" w:name="List Number"/>
-    <w:lsdException w:uiPriority="99" w:semiHidden="0" w:name="List 2"/>
-    <w:lsdException w:uiPriority="99" w:semiHidden="0" w:name="List 3"/>
+    <w:lsdException w:qFormat="1" w:uiPriority="99" w:semiHidden="0" w:name="List 2"/>
+    <w:lsdException w:qFormat="1" w:uiPriority="99" w:semiHidden="0" w:name="List 3"/>
     <w:lsdException w:uiPriority="99" w:name="List 4"/>
     <w:lsdException w:uiPriority="99" w:name="List 5"/>
-    <w:lsdException w:uiPriority="99" w:semiHidden="0" w:name="List Bullet 2"/>
+    <w:lsdException w:qFormat="1" w:uiPriority="99" w:semiHidden="0" w:name="List Bullet 2"/>
     <w:lsdException w:uiPriority="99" w:semiHidden="0" w:name="List Bullet 3"/>
     <w:lsdException w:uiPriority="99" w:name="List Bullet 4"/>
     <w:lsdException w:uiPriority="99" w:name="List Bullet 5"/>
@@ -1297,10 +1908,10 @@
     <w:lsdException w:uiPriority="99" w:name="Closing"/>
     <w:lsdException w:uiPriority="99" w:name="Signature"/>
     <w:lsdException w:uiPriority="1" w:name="Default Paragraph Font"/>
-    <w:lsdException w:uiPriority="99" w:semiHidden="0" w:name="Body Text"/>
+    <w:lsdException w:qFormat="1" w:uiPriority="99" w:semiHidden="0" w:name="Body Text"/>
     <w:lsdException w:uiPriority="99" w:name="Body Text Indent"/>
     <w:lsdException w:uiPriority="99" w:semiHidden="0" w:name="List Continue"/>
-    <w:lsdException w:uiPriority="99" w:semiHidden="0" w:name="List Continue 2"/>
+    <w:lsdException w:qFormat="1" w:uiPriority="99" w:semiHidden="0" w:name="List Continue 2"/>
     <w:lsdException w:uiPriority="99" w:semiHidden="0" w:name="List Continue 3"/>
     <w:lsdException w:uiPriority="99" w:name="List Continue 4"/>
     <w:lsdException w:uiPriority="99" w:name="List Continue 5"/>
@@ -1382,8 +1993,8 @@
     <w:lsdException w:unhideWhenUsed="0" w:uiPriority="59" w:semiHidden="0" w:name="Table Grid"/>
     <w:lsdException w:uiPriority="99" w:name="Table Theme"/>
     <w:lsdException w:qFormat="1" w:unhideWhenUsed="0" w:uiPriority="1" w:semiHidden="0" w:name="No Spacing"/>
-    <w:lsdException w:unhideWhenUsed="0" w:uiPriority="60" w:semiHidden="0" w:name="Light Shading"/>
-    <w:lsdException w:unhideWhenUsed="0" w:uiPriority="61" w:semiHidden="0" w:name="Light List"/>
+    <w:lsdException w:qFormat="1" w:unhideWhenUsed="0" w:uiPriority="60" w:semiHidden="0" w:name="Light Shading"/>
+    <w:lsdException w:qFormat="1" w:unhideWhenUsed="0" w:uiPriority="61" w:semiHidden="0" w:name="Light List"/>
     <w:lsdException w:unhideWhenUsed="0" w:uiPriority="62" w:semiHidden="0" w:name="Light Grid"/>
     <w:lsdException w:unhideWhenUsed="0" w:uiPriority="63" w:semiHidden="0" w:name="Medium Shading 1"/>
     <w:lsdException w:unhideWhenUsed="0" w:uiPriority="64" w:semiHidden="0" w:name="Medium Shading 2"/>
@@ -1401,7 +2012,7 @@
     <w:lsdException w:qFormat="1" w:unhideWhenUsed="0" w:uiPriority="62" w:semiHidden="0" w:name="Light Grid Accent 1"/>
     <w:lsdException w:unhideWhenUsed="0" w:uiPriority="63" w:semiHidden="0" w:name="Medium Shading 1 Accent 1"/>
     <w:lsdException w:unhideWhenUsed="0" w:uiPriority="64" w:semiHidden="0" w:name="Medium Shading 2 Accent 1"/>
-    <w:lsdException w:unhideWhenUsed="0" w:uiPriority="65" w:semiHidden="0" w:name="Medium List 1 Accent 1"/>
+    <w:lsdException w:qFormat="1" w:unhideWhenUsed="0" w:uiPriority="65" w:semiHidden="0" w:name="Medium List 1 Accent 1"/>
     <w:lsdException w:qFormat="1" w:unhideWhenUsed="0" w:uiPriority="34" w:semiHidden="0" w:name="List Paragraph"/>
     <w:lsdException w:qFormat="1" w:unhideWhenUsed="0" w:uiPriority="29" w:semiHidden="0" w:name="Quote"/>
     <w:lsdException w:qFormat="1" w:unhideWhenUsed="0" w:uiPriority="30" w:semiHidden="0" w:name="Intense Quote"/>
@@ -1428,7 +2039,7 @@
     <w:lsdException w:unhideWhenUsed="0" w:uiPriority="72" w:semiHidden="0" w:name="Colorful List Accent 2"/>
     <w:lsdException w:unhideWhenUsed="0" w:uiPriority="73" w:semiHidden="0" w:name="Colorful Grid Accent 2"/>
     <w:lsdException w:unhideWhenUsed="0" w:uiPriority="60" w:semiHidden="0" w:name="Light Shading Accent 3"/>
-    <w:lsdException w:unhideWhenUsed="0" w:uiPriority="61" w:semiHidden="0" w:name="Light List Accent 3"/>
+    <w:lsdException w:qFormat="1" w:unhideWhenUsed="0" w:uiPriority="61" w:semiHidden="0" w:name="Light List Accent 3"/>
     <w:lsdException w:unhideWhenUsed="0" w:uiPriority="62" w:semiHidden="0" w:name="Light Grid Accent 3"/>
     <w:lsdException w:unhideWhenUsed="0" w:uiPriority="63" w:semiHidden="0" w:name="Medium Shading 1 Accent 3"/>
     <w:lsdException w:unhideWhenUsed="0" w:uiPriority="64" w:semiHidden="0" w:name="Medium Shading 2 Accent 3"/>
@@ -1446,7 +2057,7 @@
     <w:lsdException w:unhideWhenUsed="0" w:uiPriority="62" w:semiHidden="0" w:name="Light Grid Accent 4"/>
     <w:lsdException w:unhideWhenUsed="0" w:uiPriority="63" w:semiHidden="0" w:name="Medium Shading 1 Accent 4"/>
     <w:lsdException w:unhideWhenUsed="0" w:uiPriority="64" w:semiHidden="0" w:name="Medium Shading 2 Accent 4"/>
-    <w:lsdException w:unhideWhenUsed="0" w:uiPriority="65" w:semiHidden="0" w:name="Medium List 1 Accent 4"/>
+    <w:lsdException w:qFormat="1" w:unhideWhenUsed="0" w:uiPriority="65" w:semiHidden="0" w:name="Medium List 1 Accent 4"/>
     <w:lsdException w:qFormat="1" w:unhideWhenUsed="0" w:uiPriority="66" w:semiHidden="0" w:name="Medium List 2 Accent 4"/>
     <w:lsdException w:unhideWhenUsed="0" w:uiPriority="67" w:semiHidden="0" w:name="Medium Grid 1 Accent 4"/>
     <w:lsdException w:unhideWhenUsed="0" w:uiPriority="68" w:semiHidden="0" w:name="Medium Grid 2 Accent 4"/>
@@ -1455,7 +2066,7 @@
     <w:lsdException w:unhideWhenUsed="0" w:uiPriority="71" w:semiHidden="0" w:name="Colorful Shading Accent 4"/>
     <w:lsdException w:unhideWhenUsed="0" w:uiPriority="72" w:semiHidden="0" w:name="Colorful List Accent 4"/>
     <w:lsdException w:unhideWhenUsed="0" w:uiPriority="73" w:semiHidden="0" w:name="Colorful Grid Accent 4"/>
-    <w:lsdException w:unhideWhenUsed="0" w:uiPriority="60" w:semiHidden="0" w:name="Light Shading Accent 5"/>
+    <w:lsdException w:qFormat="1" w:unhideWhenUsed="0" w:uiPriority="60" w:semiHidden="0" w:name="Light Shading Accent 5"/>
     <w:lsdException w:unhideWhenUsed="0" w:uiPriority="61" w:semiHidden="0" w:name="Light List Accent 5"/>
     <w:lsdException w:unhideWhenUsed="0" w:uiPriority="62" w:semiHidden="0" w:name="Light Grid Accent 5"/>
     <w:lsdException w:unhideWhenUsed="0" w:uiPriority="63" w:semiHidden="0" w:name="Medium Shading 1 Accent 5"/>
@@ -1782,6 +2393,7 @@
     <w:name w:val="List 3"/>
     <w:basedOn w:val="1"/>
     <w:unhideWhenUsed/>
+    <w:qFormat/>
     <w:uiPriority w:val="99"/>
     <w:pPr>
       <w:ind w:left="1080" w:hanging="360"/>
@@ -1883,6 +2495,7 @@
     <w:basedOn w:val="1"/>
     <w:link w:val="144"/>
     <w:unhideWhenUsed/>
+    <w:qFormat/>
     <w:uiPriority w:val="99"/>
     <w:pPr>
       <w:spacing w:after="120"/>
@@ -1905,6 +2518,7 @@
     <w:name w:val="List 2"/>
     <w:basedOn w:val="1"/>
     <w:unhideWhenUsed/>
+    <w:qFormat/>
     <w:uiPriority w:val="99"/>
     <w:pPr>
       <w:ind w:left="720" w:hanging="360"/>
@@ -1926,6 +2540,7 @@
     <w:name w:val="List Bullet 2"/>
     <w:basedOn w:val="1"/>
     <w:unhideWhenUsed/>
+    <w:qFormat/>
     <w:uiPriority w:val="99"/>
     <w:pPr>
       <w:numPr>
@@ -1940,6 +2555,7 @@
     <w:basedOn w:val="1"/>
     <w:link w:val="136"/>
     <w:unhideWhenUsed/>
+    <w:qFormat/>
     <w:uiPriority w:val="99"/>
     <w:pPr>
       <w:tabs>
@@ -1954,6 +2570,7 @@
     <w:basedOn w:val="1"/>
     <w:link w:val="135"/>
     <w:unhideWhenUsed/>
+    <w:qFormat/>
     <w:uiPriority w:val="99"/>
     <w:pPr>
       <w:tabs>
@@ -1989,6 +2606,7 @@
     <w:name w:val="List"/>
     <w:basedOn w:val="1"/>
     <w:unhideWhenUsed/>
+    <w:qFormat/>
     <w:uiPriority w:val="99"/>
     <w:pPr>
       <w:ind w:left="360" w:hanging="360"/>
@@ -2009,6 +2627,7 @@
     <w:name w:val="List Continue 2"/>
     <w:basedOn w:val="1"/>
     <w:unhideWhenUsed/>
+    <w:qFormat/>
     <w:uiPriority w:val="99"/>
     <w:pPr>
       <w:spacing w:after="120"/>
@@ -2077,6 +2696,7 @@
   <w:style w:type="table" w:styleId="34">
     <w:name w:val="Light Shading"/>
     <w:basedOn w:val="32"/>
+    <w:qFormat/>
     <w:uiPriority w:val="60"/>
     <w:pPr>
       <w:spacing w:after="0" w:line="240" w:lineRule="auto"/>
@@ -2572,6 +3192,7 @@
   <w:style w:type="table" w:styleId="39">
     <w:name w:val="Light Shading Accent 5"/>
     <w:basedOn w:val="32"/>
+    <w:qFormat/>
     <w:uiPriority w:val="60"/>
     <w:pPr>
       <w:spacing w:after="0" w:line="240" w:lineRule="auto"/>
@@ -2770,6 +3391,7 @@
   <w:style w:type="table" w:styleId="41">
     <w:name w:val="Light List"/>
     <w:basedOn w:val="32"/>
+    <w:qFormat/>
     <w:uiPriority w:val="61"/>
     <w:pPr>
       <w:spacing w:after="0" w:line="240" w:lineRule="auto"/>
@@ -3049,6 +3671,7 @@
   <w:style w:type="table" w:styleId="44">
     <w:name w:val="Light List Accent 3"/>
     <w:basedOn w:val="32"/>
+    <w:qFormat/>
     <w:uiPriority w:val="61"/>
     <w:pPr>
       <w:spacing w:after="0" w:line="240" w:lineRule="auto"/>
@@ -6298,6 +6921,7 @@
   <w:style w:type="table" w:styleId="70">
     <w:name w:val="Medium List 1 Accent 1"/>
     <w:basedOn w:val="32"/>
+    <w:qFormat/>
     <w:uiPriority w:val="65"/>
     <w:pPr>
       <w:spacing w:after="0" w:line="240" w:lineRule="auto"/>
@@ -6568,6 +7192,7 @@
   <w:style w:type="table" w:styleId="73">
     <w:name w:val="Medium List 1 Accent 4"/>
     <w:basedOn w:val="32"/>
+    <w:qFormat/>
     <w:uiPriority w:val="65"/>
     <w:pPr>
       <w:spacing w:after="0" w:line="240" w:lineRule="auto"/>

</xml_diff>

<commit_message>
docs: document Proc2 block-size test
</commit_message>
<xml_diff>
--- a/document/CUDA图像渐变融合开发优化流程报告.docx
+++ b/document/CUDA图像渐变融合开发优化流程报告.docx
@@ -1604,14 +1604,495 @@
       <w:pPr>
         <w:spacing w:after="120"/>
         <w:rPr>
+          <w:rFonts w:hint="eastAsia"/>
+          <w:lang w:val="en-US" w:eastAsia="zh-CN"/>
+        </w:rPr>
+      </w:pPr>
+      <w:r>
+        <w:rPr>
+          <w:rFonts w:hint="eastAsia"/>
+          <w:lang w:val="en-US" w:eastAsia="zh-CN"/>
+        </w:rPr>
+        <w:t>本次测试主要测试实现重叠CPU的执行和GPU的执行。Proc5 CPU测采用3线程调用Proc3的CUDA逻辑，而Proc5_Compare则串行调用。</w:t>
+      </w:r>
+    </w:p>
+    <w:p>
+      <w:pPr>
+        <w:spacing w:after="120"/>
+        <w:rPr>
+          <w:rFonts w:hint="eastAsia"/>
+          <w:b/>
+          <w:sz w:val="26"/>
+          <w:lang w:val="en-US" w:eastAsia="zh-CN"/>
+        </w:rPr>
+      </w:pPr>
+      <w:r>
+        <w:rPr>
+          <w:rFonts w:hint="eastAsia"/>
+          <w:b/>
+          <w:sz w:val="26"/>
+          <w:lang w:val="en-US" w:eastAsia="zh-CN"/>
+        </w:rPr>
+        <w:t>测试结果：</w:t>
+      </w:r>
+    </w:p>
+    <w:p>
+      <w:pPr>
+        <w:spacing w:after="120"/>
+        <w:rPr>
+          <w:rFonts w:hint="eastAsia"/>
+          <w:lang w:val="en-US" w:eastAsia="zh-CN"/>
+        </w:rPr>
+      </w:pPr>
+      <w:r>
+        <w:drawing>
+          <wp:inline distT="0" distB="0" distL="114300" distR="114300">
+            <wp:extent cx="5939790" cy="1986915"/>
+            <wp:effectExtent l="0" t="0" r="3810" b="6985"/>
+            <wp:docPr id="5" name="图片 1"/>
+            <wp:cNvGraphicFramePr>
+              <a:graphicFrameLocks xmlns:a="http://schemas.openxmlformats.org/drawingml/2006/main" noChangeAspect="1"/>
+            </wp:cNvGraphicFramePr>
+            <a:graphic xmlns:a="http://schemas.openxmlformats.org/drawingml/2006/main">
+              <a:graphicData uri="http://schemas.openxmlformats.org/drawingml/2006/picture">
+                <pic:pic xmlns:pic="http://schemas.openxmlformats.org/drawingml/2006/picture">
+                  <pic:nvPicPr>
+                    <pic:cNvPr id="5" name="图片 1"/>
+                    <pic:cNvPicPr>
+                      <a:picLocks noChangeAspect="1"/>
+                    </pic:cNvPicPr>
+                  </pic:nvPicPr>
+                  <pic:blipFill>
+                    <a:blip r:embed="rId10"/>
+                    <a:stretch>
+                      <a:fillRect/>
+                    </a:stretch>
+                  </pic:blipFill>
+                  <pic:spPr>
+                    <a:xfrm>
+                      <a:off x="0" y="0"/>
+                      <a:ext cx="5939790" cy="1986915"/>
+                    </a:xfrm>
+                    <a:prstGeom prst="rect">
+                      <a:avLst/>
+                    </a:prstGeom>
+                    <a:noFill/>
+                    <a:ln>
+                      <a:noFill/>
+                    </a:ln>
+                  </pic:spPr>
+                </pic:pic>
+              </a:graphicData>
+            </a:graphic>
+          </wp:inline>
+        </w:drawing>
+      </w:r>
+    </w:p>
+    <w:p>
+      <w:pPr>
+        <w:spacing w:after="120"/>
+        <w:rPr>
+          <w:rFonts w:hint="default"/>
+          <w:lang w:val="en-US" w:eastAsia="zh-CN"/>
+        </w:rPr>
+      </w:pPr>
+      <w:r>
+        <w:rPr>
+          <w:rFonts w:hint="eastAsia"/>
+          <w:lang w:val="en-US" w:eastAsia="zh-CN"/>
+        </w:rPr>
+        <w:t>对当前任务，最后5轮平均结果显示，并发CPU侧统计耗时比串行减少5.75ms，提速约7.6%，但是并发GPU累计耗时却比串行高。因此，CPU多线程并发的价值主要在于并行化主机端 CUDA 资源管理和任务提交，并缩短三条流水线的整体等待路径；GPU 单项执行并未显著加速，且存在轻微资源竞争。由于当前的核函数较为简单，且每个核函数有约33284个block，每块256线程，几乎铺满当前的RTX4050的SM资源，导致无法呈现多线程对应的核函数的重叠收益。</w:t>
+      </w:r>
+    </w:p>
+    <w:p>
+      <w:pPr>
+        <w:spacing w:after="120"/>
+        <w:rPr>
+          <w:rFonts w:hint="eastAsia"/>
+          <w:lang w:val="en-US" w:eastAsia="zh-CN"/>
+        </w:rPr>
+      </w:pPr>
+    </w:p>
+    <w:p>
+      <w:pPr>
+        <w:spacing w:after="120"/>
+        <w:rPr>
           <w:rFonts w:hint="default"/>
           <w:b/>
           <w:sz w:val="26"/>
           <w:lang w:val="en-US" w:eastAsia="zh-CN"/>
         </w:rPr>
       </w:pPr>
+      <w:r>
+        <w:rPr>
+          <w:rFonts w:hint="eastAsia"/>
+          <w:b/>
+          <w:sz w:val="26"/>
+          <w:lang w:val="en-US" w:eastAsia="zh-CN"/>
+        </w:rPr>
+        <w:t>实现6</w:t>
+      </w:r>
+    </w:p>
+    <w:p>
+      <w:pPr>
+        <w:spacing w:after="120"/>
+        <w:rPr>
+          <w:rFonts w:hint="eastAsia"/>
+          <w:lang w:val="en-US" w:eastAsia="zh-CN"/>
+        </w:rPr>
+      </w:pPr>
+      <w:r>
+        <w:rPr>
+          <w:rFonts w:hint="eastAsia"/>
+          <w:lang w:val="en-US" w:eastAsia="zh-CN"/>
+        </w:rPr>
+        <w:t>本次测试主要测试锁页内存，Proc6采用一次性申请连续17片锁页内存，每轮将数据复制到锁页内存，然后执行与Proc3相同的双CUDA流流水线。固定内存的申请和释放不计入耗时。</w:t>
+      </w:r>
+    </w:p>
+    <w:p>
+      <w:pPr>
+        <w:spacing w:after="120"/>
+        <w:rPr>
+          <w:rFonts w:hint="default"/>
+          <w:lang w:val="en-US" w:eastAsia="zh-CN"/>
+        </w:rPr>
+      </w:pPr>
+    </w:p>
+    <w:p>
+      <w:pPr>
+        <w:spacing w:after="120"/>
+        <w:rPr>
+          <w:rFonts w:hint="eastAsia"/>
+          <w:b/>
+          <w:sz w:val="26"/>
+          <w:lang w:val="en-US" w:eastAsia="zh-CN"/>
+        </w:rPr>
+      </w:pPr>
+      <w:r>
+        <w:rPr>
+          <w:rFonts w:hint="eastAsia"/>
+          <w:b/>
+          <w:sz w:val="26"/>
+          <w:lang w:val="en-US" w:eastAsia="zh-CN"/>
+        </w:rPr>
+        <w:t>测试结果：</w:t>
+      </w:r>
+    </w:p>
+    <w:p>
+      <w:pPr>
+        <w:spacing w:after="120"/>
+        <w:rPr>
+          <w:rFonts w:hint="eastAsia"/>
+          <w:lang w:val="en-US" w:eastAsia="zh-CN"/>
+        </w:rPr>
+      </w:pPr>
+      <w:r>
+        <w:rPr>
+          <w:rFonts w:hint="eastAsia"/>
+          <w:lang w:val="en-US" w:eastAsia="zh-CN"/>
+        </w:rPr>
+        <w:t>Proc6 CPU侧总耗时27.1ms，较Proc324.1ms反而变慢了，即使固定内存的申请和释放并没有放到计时内。图像从普通内存拷贝到锁页内存中的时间甚至超过Proc3反复注册页面的时间。固定锁页内存更适合数据一开始就写在锁页内存里，而不是需要再拷贝一次。若将固定内存的释放和申请平均到10轮，同时去除图像拷贝的时间，则执行轮次越久，申请和释放固定内存的平均成本则越低，性能上相比于动态注册锁页内存的优势越明显。</w:t>
+      </w:r>
+    </w:p>
+    <w:p>
+      <w:pPr>
+        <w:spacing w:after="120"/>
+        <w:rPr>
+          <w:rFonts w:hint="eastAsia"/>
+          <w:lang w:val="en-US" w:eastAsia="zh-CN"/>
+        </w:rPr>
+      </w:pPr>
+    </w:p>
+    <w:p>
+      <w:pPr>
+        <w:spacing w:after="120"/>
+        <w:rPr>
+          <w:rFonts w:hint="default"/>
+          <w:b/>
+          <w:sz w:val="26"/>
+          <w:lang w:val="en-US" w:eastAsia="zh-CN"/>
+        </w:rPr>
+      </w:pPr>
+      <w:r>
+        <w:rPr>
+          <w:rFonts w:hint="eastAsia"/>
+          <w:b/>
+          <w:sz w:val="26"/>
+          <w:lang w:val="en-US" w:eastAsia="zh-CN"/>
+        </w:rPr>
+        <w:t>实现7</w:t>
+      </w:r>
+    </w:p>
+    <w:p>
+      <w:pPr>
+        <w:spacing w:after="120"/>
+        <w:rPr>
+          <w:rFonts w:hint="eastAsia"/>
+          <w:lang w:val="en-US" w:eastAsia="zh-CN"/>
+        </w:rPr>
+      </w:pPr>
+      <w:r>
+        <w:rPr>
+          <w:rFonts w:hint="eastAsia"/>
+          <w:lang w:val="en-US" w:eastAsia="zh-CN"/>
+        </w:rPr>
+        <w:t>本次测试的主要目的是控制单个核函数对SM的占用率，实现多个核函数间的并行。并通过对比试验，分析核函数串并行下的性能影响。Proc7将两个核函数放入异步流中，通过限制block数量和单个block线程的数量限制SM占用率，通过先调用低占用率的核函数，再调用高占用率的核函数，从而实现并行。对比实验Proc7_Compare将不再限制核函数的block和单个block线程数量，将两个核函数放入同一个stream中。</w:t>
+      </w:r>
+    </w:p>
+    <w:p>
+      <w:pPr>
+        <w:spacing w:after="120"/>
+        <w:rPr>
+          <w:rFonts w:hint="eastAsia"/>
+          <w:b/>
+          <w:sz w:val="26"/>
+          <w:lang w:val="en-US" w:eastAsia="zh-CN"/>
+        </w:rPr>
+      </w:pPr>
+      <w:r>
+        <w:rPr>
+          <w:rFonts w:hint="eastAsia"/>
+          <w:b/>
+          <w:sz w:val="26"/>
+          <w:lang w:val="en-US" w:eastAsia="zh-CN"/>
+        </w:rPr>
+        <w:t>测试结果：</w:t>
+      </w:r>
+    </w:p>
+    <w:p>
+      <w:pPr>
+        <w:spacing w:after="120"/>
+        <w:rPr>
+          <w:rFonts w:hint="eastAsia"/>
+          <w:b/>
+          <w:sz w:val="26"/>
+          <w:lang w:val="en-US" w:eastAsia="zh-CN"/>
+        </w:rPr>
+      </w:pPr>
+      <w:r>
+        <w:drawing>
+          <wp:inline distT="0" distB="0" distL="114300" distR="114300">
+            <wp:extent cx="4966335" cy="1075055"/>
+            <wp:effectExtent l="0" t="0" r="12065" b="4445"/>
+            <wp:docPr id="6" name="图片 1"/>
+            <wp:cNvGraphicFramePr>
+              <a:graphicFrameLocks xmlns:a="http://schemas.openxmlformats.org/drawingml/2006/main" noChangeAspect="1"/>
+            </wp:cNvGraphicFramePr>
+            <a:graphic xmlns:a="http://schemas.openxmlformats.org/drawingml/2006/main">
+              <a:graphicData uri="http://schemas.openxmlformats.org/drawingml/2006/picture">
+                <pic:pic xmlns:pic="http://schemas.openxmlformats.org/drawingml/2006/picture">
+                  <pic:nvPicPr>
+                    <pic:cNvPr id="6" name="图片 1"/>
+                    <pic:cNvPicPr>
+                      <a:picLocks noChangeAspect="1"/>
+                    </pic:cNvPicPr>
+                  </pic:nvPicPr>
+                  <pic:blipFill>
+                    <a:blip r:embed="rId11"/>
+                    <a:stretch>
+                      <a:fillRect/>
+                    </a:stretch>
+                  </pic:blipFill>
+                  <pic:spPr>
+                    <a:xfrm>
+                      <a:off x="0" y="0"/>
+                      <a:ext cx="4966335" cy="1075055"/>
+                    </a:xfrm>
+                    <a:prstGeom prst="rect">
+                      <a:avLst/>
+                    </a:prstGeom>
+                    <a:noFill/>
+                    <a:ln>
+                      <a:noFill/>
+                    </a:ln>
+                  </pic:spPr>
+                </pic:pic>
+              </a:graphicData>
+            </a:graphic>
+          </wp:inline>
+        </w:drawing>
+      </w:r>
+    </w:p>
+    <w:p>
+      <w:pPr>
+        <w:spacing w:after="120"/>
+        <w:rPr>
+          <w:rFonts w:hint="eastAsia"/>
+          <w:lang w:val="en-US" w:eastAsia="zh-CN"/>
+        </w:rPr>
+      </w:pPr>
+      <w:r>
+        <w:drawing>
+          <wp:inline distT="0" distB="0" distL="114300" distR="114300">
+            <wp:extent cx="3884295" cy="2688590"/>
+            <wp:effectExtent l="0" t="0" r="1905" b="3810"/>
+            <wp:docPr id="7" name="图片 2"/>
+            <wp:cNvGraphicFramePr>
+              <a:graphicFrameLocks xmlns:a="http://schemas.openxmlformats.org/drawingml/2006/main" noChangeAspect="1"/>
+            </wp:cNvGraphicFramePr>
+            <a:graphic xmlns:a="http://schemas.openxmlformats.org/drawingml/2006/main">
+              <a:graphicData uri="http://schemas.openxmlformats.org/drawingml/2006/picture">
+                <pic:pic xmlns:pic="http://schemas.openxmlformats.org/drawingml/2006/picture">
+                  <pic:nvPicPr>
+                    <pic:cNvPr id="7" name="图片 2"/>
+                    <pic:cNvPicPr>
+                      <a:picLocks noChangeAspect="1"/>
+                    </pic:cNvPicPr>
+                  </pic:nvPicPr>
+                  <pic:blipFill>
+                    <a:blip r:embed="rId12"/>
+                    <a:stretch>
+                      <a:fillRect/>
+                    </a:stretch>
+                  </pic:blipFill>
+                  <pic:spPr>
+                    <a:xfrm>
+                      <a:off x="0" y="0"/>
+                      <a:ext cx="3884295" cy="2688590"/>
+                    </a:xfrm>
+                    <a:prstGeom prst="rect">
+                      <a:avLst/>
+                    </a:prstGeom>
+                    <a:noFill/>
+                    <a:ln>
+                      <a:noFill/>
+                    </a:ln>
+                  </pic:spPr>
+                </pic:pic>
+              </a:graphicData>
+            </a:graphic>
+          </wp:inline>
+        </w:drawing>
+      </w:r>
+    </w:p>
+    <w:p>
+      <w:pPr>
+        <w:spacing w:after="120"/>
+        <w:rPr>
+          <w:rFonts w:hint="default"/>
+          <w:lang w:val="en-US" w:eastAsia="zh-CN"/>
+        </w:rPr>
+      </w:pPr>
+      <w:r>
+        <w:rPr>
+          <w:rFonts w:hint="eastAsia"/>
+          <w:lang w:val="en-US" w:eastAsia="zh-CN"/>
+        </w:rPr>
+        <w:t>通过nsight system数据分析，Proc7确实存在核函数并行，两个核函数有约3.0s的重叠时间，但低占用率的核函数因并行度不足，耗时反而比串行总耗时更长。</w:t>
+      </w:r>
+    </w:p>
+    <w:p>
+      <w:pPr>
+        <w:spacing w:after="120"/>
+        <w:rPr>
+          <w:rFonts w:hint="default"/>
+          <w:lang w:val="en-US" w:eastAsia="zh-CN"/>
+        </w:rPr>
+      </w:pPr>
       <w:bookmarkStart w:id="0" w:name="_GoBack"/>
       <w:bookmarkEnd w:id="0"/>
+    </w:p>
+    <w:p>
+      <w:pPr>
+        <w:spacing w:after="120"/>
+        <w:rPr>
+          <w:rFonts w:hint="default"/>
+          <w:b/>
+          <w:sz w:val="26"/>
+          <w:lang w:val="en-US" w:eastAsia="zh-CN"/>
+        </w:rPr>
+      </w:pPr>
+      <w:r>
+        <w:rPr>
+          <w:b/>
+          <w:rFonts w:hint="eastAsia"/>
+          <w:sz w:val="26"/>
+        </w:rPr>
+        <w:t>实现8</w:t>
+      </w:r>
+    </w:p>
+    <w:p>
+      <w:pPr>
+        <w:spacing w:after="120"/>
+        <w:rPr>
+          <w:rFonts w:hint="default"/>
+          <w:lang w:val="en-US" w:eastAsia="zh-CN"/>
+        </w:rPr>
+      </w:pPr>
+      <w:r>
+        <w:rPr>
+          <w:b w:val="0"/>
+          <w:rFonts w:hint="eastAsia"/>
+        </w:rPr>
+        <w:t>本实验通过 Proc2 的三参数重载测试不同 block 线程数对融合核函数效率的影响。该重载保持输入图像、16 图二叉归约逻辑、显存申请与传输、运行次数以及正确性校验完全一致；唯一变量为每个 block 的线程数。每个候选值执行 10 次，统计后 5 次的平均值，并用 CUDA event 单独记录 15 次 blendImage 核函数的总耗时。</w:t>
+      </w:r>
+    </w:p>
+    <w:p>
+      <w:pPr>
+        <w:spacing w:after="120"/>
+        <w:rPr>
+          <w:rFonts w:hint="eastAsia"/>
+          <w:b/>
+          <w:sz w:val="26"/>
+          <w:lang w:val="en-US" w:eastAsia="zh-CN"/>
+        </w:rPr>
+      </w:pPr>
+      <w:r>
+        <w:rPr>
+          <w:b/>
+          <w:rFonts w:hint="eastAsia"/>
+          <w:sz w:val="26"/>
+        </w:rPr>
+        <w:t>测试结果：</w:t>
+      </w:r>
+    </w:p>
+    <w:p>
+      <w:pPr>
+        <w:spacing w:after="120"/>
+        <w:rPr>
+          <w:rFonts w:hint="default"/>
+          <w:lang w:val="en-US" w:eastAsia="zh-CN"/>
+        </w:rPr>
+      </w:pPr>
+      <w:r>
+        <w:rPr>
+          <w:b w:val="0"/>
+          <w:rFonts w:hint="eastAsia"/>
+        </w:rPr>
+        <w:t>反向候选顺序复测的 15 个融合核函数平均耗时分别为：64 线程/block 为 2.621 ms，128 线程/block 为 2.319 ms，256 线程/block 为 2.349 ms，512 线程/block 为 2.408 ms，1024 线程/block 为 3.528 ms。所有候选值均通过 CPU 与 GPU 像素级结果校验。</w:t>
+      </w:r>
+    </w:p>
+    <w:p>
+      <w:pPr>
+        <w:spacing w:after="120"/>
+        <w:rPr>
+          <w:rFonts w:hint="default"/>
+          <w:lang w:val="en-US" w:eastAsia="zh-CN"/>
+        </w:rPr>
+      </w:pPr>
+      <w:r>
+        <w:rPr>
+          <w:b w:val="0"/>
+          <w:rFonts w:hint="eastAsia"/>
+        </w:rPr>
+        <w:t>128 线程/block 最快；256 线程/block 仅慢约 1.3%，属于接近的可用选择；512 线程/block 慢约 3.8%；64 线程/block 因每 block 仅有 2 个 warp，访存并发与隐藏延迟能力较弱；1024 线程/block 因资源分配粒度过大，降低了驻留 block 数与调度灵活性，最慢约 52%。</w:t>
+      </w:r>
+    </w:p>
+    <w:p>
+      <w:pPr>
+        <w:spacing w:after="120"/>
+        <w:rPr>
+          <w:rFonts w:hint="default"/>
+          <w:lang w:val="en-US" w:eastAsia="zh-CN"/>
+        </w:rPr>
+      </w:pPr>
+      <w:r>
+        <w:rPr>
+          <w:b w:val="0"/>
+          <w:rFonts w:hint="eastAsia"/>
+        </w:rPr>
+        <w:t>该 blendImage 为连续访存、每线程只处理一个像素的带宽型核函数。实际工程建议默认使用 128 线程/block；若需要与其他核函数统一配置，256 线程/block 的性能损失很小，也可接受。完整 wall 时间还包含显存申请释放与 H2D、D2H 传输，波动较大，因此 block 大小的选择应以 CUDA event 记录的 kernel 时间为主要依据。</w:t>
+      </w:r>
     </w:p>
     <w:sectPr>
       <w:pgSz w:w="12240" w:h="15840"/>
@@ -1836,7 +2317,7 @@
   <w:docDefaults>
     <w:rPrDefault>
       <w:rPr>
-        <w:rFonts w:asciiTheme="minorHAnsi" w:hAnsiTheme="minorHAnsi" w:eastAsiaTheme="minorEastAsia" w:cstheme="minorBidi"/>
+        <w:rFonts w:ascii="Times New Roman" w:hAnsi="Times New Roman" w:eastAsia="宋体" w:cs="Times New Roman"/>
       </w:rPr>
     </w:rPrDefault>
     <w:pPrDefault/>
@@ -1887,30 +2368,30 @@
     <w:lsdException w:uiPriority="99" w:name="endnote reference"/>
     <w:lsdException w:uiPriority="99" w:name="endnote text"/>
     <w:lsdException w:uiPriority="99" w:name="table of authorities"/>
-    <w:lsdException w:uiPriority="99" w:semiHidden="0" w:name="macro"/>
+    <w:lsdException w:qFormat="1" w:uiPriority="99" w:semiHidden="0" w:name="macro"/>
     <w:lsdException w:uiPriority="99" w:name="toa heading"/>
     <w:lsdException w:qFormat="1" w:uiPriority="99" w:semiHidden="0" w:name="List"/>
-    <w:lsdException w:uiPriority="99" w:semiHidden="0" w:name="List Bullet"/>
-    <w:lsdException w:uiPriority="99" w:semiHidden="0" w:name="List Number"/>
+    <w:lsdException w:qFormat="1" w:uiPriority="99" w:semiHidden="0" w:name="List Bullet"/>
+    <w:lsdException w:qFormat="1" w:uiPriority="99" w:semiHidden="0" w:name="List Number"/>
     <w:lsdException w:qFormat="1" w:uiPriority="99" w:semiHidden="0" w:name="List 2"/>
     <w:lsdException w:qFormat="1" w:uiPriority="99" w:semiHidden="0" w:name="List 3"/>
     <w:lsdException w:uiPriority="99" w:name="List 4"/>
     <w:lsdException w:uiPriority="99" w:name="List 5"/>
     <w:lsdException w:qFormat="1" w:uiPriority="99" w:semiHidden="0" w:name="List Bullet 2"/>
-    <w:lsdException w:uiPriority="99" w:semiHidden="0" w:name="List Bullet 3"/>
+    <w:lsdException w:qFormat="1" w:uiPriority="99" w:semiHidden="0" w:name="List Bullet 3"/>
     <w:lsdException w:uiPriority="99" w:name="List Bullet 4"/>
     <w:lsdException w:uiPriority="99" w:name="List Bullet 5"/>
-    <w:lsdException w:uiPriority="99" w:semiHidden="0" w:name="List Number 2"/>
-    <w:lsdException w:uiPriority="99" w:semiHidden="0" w:name="List Number 3"/>
+    <w:lsdException w:qFormat="1" w:uiPriority="99" w:semiHidden="0" w:name="List Number 2"/>
+    <w:lsdException w:qFormat="1" w:uiPriority="99" w:semiHidden="0" w:name="List Number 3"/>
     <w:lsdException w:uiPriority="99" w:name="List Number 4"/>
     <w:lsdException w:uiPriority="99" w:name="List Number 5"/>
     <w:lsdException w:qFormat="1" w:unhideWhenUsed="0" w:uiPriority="10" w:semiHidden="0" w:name="Title"/>
     <w:lsdException w:uiPriority="99" w:name="Closing"/>
     <w:lsdException w:uiPriority="99" w:name="Signature"/>
-    <w:lsdException w:uiPriority="1" w:name="Default Paragraph Font"/>
+    <w:lsdException w:qFormat="1" w:uiPriority="1" w:name="Default Paragraph Font"/>
     <w:lsdException w:qFormat="1" w:uiPriority="99" w:semiHidden="0" w:name="Body Text"/>
     <w:lsdException w:uiPriority="99" w:name="Body Text Indent"/>
-    <w:lsdException w:uiPriority="99" w:semiHidden="0" w:name="List Continue"/>
+    <w:lsdException w:qFormat="1" w:uiPriority="99" w:semiHidden="0" w:name="List Continue"/>
     <w:lsdException w:qFormat="1" w:uiPriority="99" w:semiHidden="0" w:name="List Continue 2"/>
     <w:lsdException w:uiPriority="99" w:semiHidden="0" w:name="List Continue 3"/>
     <w:lsdException w:uiPriority="99" w:name="List Continue 4"/>
@@ -1922,8 +2403,8 @@
     <w:lsdException w:uiPriority="99" w:name="Body Text First Indent"/>
     <w:lsdException w:uiPriority="99" w:name="Body Text First Indent 2"/>
     <w:lsdException w:uiPriority="99" w:name="Note Heading"/>
-    <w:lsdException w:uiPriority="99" w:semiHidden="0" w:name="Body Text 2"/>
-    <w:lsdException w:uiPriority="99" w:semiHidden="0" w:name="Body Text 3"/>
+    <w:lsdException w:qFormat="1" w:uiPriority="99" w:semiHidden="0" w:name="Body Text 2"/>
+    <w:lsdException w:qFormat="1" w:uiPriority="99" w:semiHidden="0" w:name="Body Text 3"/>
     <w:lsdException w:uiPriority="99" w:name="Body Text Indent 2"/>
     <w:lsdException w:uiPriority="99" w:name="Body Text Indent 3"/>
     <w:lsdException w:uiPriority="99" w:name="Block Text"/>
@@ -1945,7 +2426,7 @@
     <w:lsdException w:uiPriority="99" w:name="HTML Sample"/>
     <w:lsdException w:uiPriority="99" w:name="HTML Typewriter"/>
     <w:lsdException w:uiPriority="99" w:name="HTML Variable"/>
-    <w:lsdException w:uiPriority="99" w:name="Normal Table"/>
+    <w:lsdException w:qFormat="1" w:uiPriority="99" w:name="Normal Table"/>
     <w:lsdException w:uiPriority="99" w:name="annotation subject"/>
     <w:lsdException w:uiPriority="99" w:name="Table Simple 1"/>
     <w:lsdException w:uiPriority="99" w:name="Table Simple 2"/>
@@ -1995,7 +2476,7 @@
     <w:lsdException w:qFormat="1" w:unhideWhenUsed="0" w:uiPriority="1" w:semiHidden="0" w:name="No Spacing"/>
     <w:lsdException w:qFormat="1" w:unhideWhenUsed="0" w:uiPriority="60" w:semiHidden="0" w:name="Light Shading"/>
     <w:lsdException w:qFormat="1" w:unhideWhenUsed="0" w:uiPriority="61" w:semiHidden="0" w:name="Light List"/>
-    <w:lsdException w:unhideWhenUsed="0" w:uiPriority="62" w:semiHidden="0" w:name="Light Grid"/>
+    <w:lsdException w:qFormat="1" w:unhideWhenUsed="0" w:uiPriority="62" w:semiHidden="0" w:name="Light Grid"/>
     <w:lsdException w:unhideWhenUsed="0" w:uiPriority="63" w:semiHidden="0" w:name="Medium Shading 1"/>
     <w:lsdException w:unhideWhenUsed="0" w:uiPriority="64" w:semiHidden="0" w:name="Medium Shading 2"/>
     <w:lsdException w:unhideWhenUsed="0" w:uiPriority="65" w:semiHidden="0" w:name="Medium List 1"/>
@@ -2004,7 +2485,7 @@
     <w:lsdException w:unhideWhenUsed="0" w:uiPriority="68" w:semiHidden="0" w:name="Medium Grid 2"/>
     <w:lsdException w:unhideWhenUsed="0" w:uiPriority="69" w:semiHidden="0" w:name="Medium Grid 3"/>
     <w:lsdException w:unhideWhenUsed="0" w:uiPriority="70" w:semiHidden="0" w:name="Dark List"/>
-    <w:lsdException w:unhideWhenUsed="0" w:uiPriority="71" w:semiHidden="0" w:name="Colorful Shading"/>
+    <w:lsdException w:qFormat="1" w:unhideWhenUsed="0" w:uiPriority="71" w:semiHidden="0" w:name="Colorful Shading"/>
     <w:lsdException w:unhideWhenUsed="0" w:uiPriority="72" w:semiHidden="0" w:name="Colorful List"/>
     <w:lsdException w:unhideWhenUsed="0" w:uiPriority="73" w:semiHidden="0" w:name="Colorful Grid"/>
     <w:lsdException w:unhideWhenUsed="0" w:uiPriority="60" w:semiHidden="0" w:name="Light Shading Accent 1"/>
@@ -2038,7 +2519,7 @@
     <w:lsdException w:unhideWhenUsed="0" w:uiPriority="71" w:semiHidden="0" w:name="Colorful Shading Accent 2"/>
     <w:lsdException w:unhideWhenUsed="0" w:uiPriority="72" w:semiHidden="0" w:name="Colorful List Accent 2"/>
     <w:lsdException w:unhideWhenUsed="0" w:uiPriority="73" w:semiHidden="0" w:name="Colorful Grid Accent 2"/>
-    <w:lsdException w:unhideWhenUsed="0" w:uiPriority="60" w:semiHidden="0" w:name="Light Shading Accent 3"/>
+    <w:lsdException w:qFormat="1" w:unhideWhenUsed="0" w:uiPriority="60" w:semiHidden="0" w:name="Light Shading Accent 3"/>
     <w:lsdException w:qFormat="1" w:unhideWhenUsed="0" w:uiPriority="61" w:semiHidden="0" w:name="Light List Accent 3"/>
     <w:lsdException w:unhideWhenUsed="0" w:uiPriority="62" w:semiHidden="0" w:name="Light Grid Accent 3"/>
     <w:lsdException w:unhideWhenUsed="0" w:uiPriority="63" w:semiHidden="0" w:name="Medium Shading 1 Accent 3"/>
@@ -2059,7 +2540,7 @@
     <w:lsdException w:unhideWhenUsed="0" w:uiPriority="64" w:semiHidden="0" w:name="Medium Shading 2 Accent 4"/>
     <w:lsdException w:qFormat="1" w:unhideWhenUsed="0" w:uiPriority="65" w:semiHidden="0" w:name="Medium List 1 Accent 4"/>
     <w:lsdException w:qFormat="1" w:unhideWhenUsed="0" w:uiPriority="66" w:semiHidden="0" w:name="Medium List 2 Accent 4"/>
-    <w:lsdException w:unhideWhenUsed="0" w:uiPriority="67" w:semiHidden="0" w:name="Medium Grid 1 Accent 4"/>
+    <w:lsdException w:qFormat="1" w:unhideWhenUsed="0" w:uiPriority="67" w:semiHidden="0" w:name="Medium Grid 1 Accent 4"/>
     <w:lsdException w:unhideWhenUsed="0" w:uiPriority="68" w:semiHidden="0" w:name="Medium Grid 2 Accent 4"/>
     <w:lsdException w:unhideWhenUsed="0" w:uiPriority="69" w:semiHidden="0" w:name="Medium Grid 3 Accent 4"/>
     <w:lsdException w:unhideWhenUsed="0" w:uiPriority="70" w:semiHidden="0" w:name="Dark List Accent 4"/>
@@ -2067,7 +2548,7 @@
     <w:lsdException w:unhideWhenUsed="0" w:uiPriority="72" w:semiHidden="0" w:name="Colorful List Accent 4"/>
     <w:lsdException w:unhideWhenUsed="0" w:uiPriority="73" w:semiHidden="0" w:name="Colorful Grid Accent 4"/>
     <w:lsdException w:qFormat="1" w:unhideWhenUsed="0" w:uiPriority="60" w:semiHidden="0" w:name="Light Shading Accent 5"/>
-    <w:lsdException w:unhideWhenUsed="0" w:uiPriority="61" w:semiHidden="0" w:name="Light List Accent 5"/>
+    <w:lsdException w:qFormat="1" w:unhideWhenUsed="0" w:uiPriority="61" w:semiHidden="0" w:name="Light List Accent 5"/>
     <w:lsdException w:unhideWhenUsed="0" w:uiPriority="62" w:semiHidden="0" w:name="Light Grid Accent 5"/>
     <w:lsdException w:unhideWhenUsed="0" w:uiPriority="63" w:semiHidden="0" w:name="Medium Shading 1 Accent 5"/>
     <w:lsdException w:unhideWhenUsed="0" w:uiPriority="64" w:semiHidden="0" w:name="Medium Shading 2 Accent 5"/>
@@ -2077,20 +2558,20 @@
     <w:lsdException w:unhideWhenUsed="0" w:uiPriority="68" w:semiHidden="0" w:name="Medium Grid 2 Accent 5"/>
     <w:lsdException w:unhideWhenUsed="0" w:uiPriority="69" w:semiHidden="0" w:name="Medium Grid 3 Accent 5"/>
     <w:lsdException w:unhideWhenUsed="0" w:uiPriority="70" w:semiHidden="0" w:name="Dark List Accent 5"/>
-    <w:lsdException w:unhideWhenUsed="0" w:uiPriority="71" w:semiHidden="0" w:name="Colorful Shading Accent 5"/>
+    <w:lsdException w:qFormat="1" w:unhideWhenUsed="0" w:uiPriority="71" w:semiHidden="0" w:name="Colorful Shading Accent 5"/>
     <w:lsdException w:unhideWhenUsed="0" w:uiPriority="72" w:semiHidden="0" w:name="Colorful List Accent 5"/>
     <w:lsdException w:unhideWhenUsed="0" w:uiPriority="73" w:semiHidden="0" w:name="Colorful Grid Accent 5"/>
     <w:lsdException w:unhideWhenUsed="0" w:uiPriority="60" w:semiHidden="0" w:name="Light Shading Accent 6"/>
-    <w:lsdException w:unhideWhenUsed="0" w:uiPriority="61" w:semiHidden="0" w:name="Light List Accent 6"/>
+    <w:lsdException w:qFormat="1" w:unhideWhenUsed="0" w:uiPriority="61" w:semiHidden="0" w:name="Light List Accent 6"/>
     <w:lsdException w:unhideWhenUsed="0" w:uiPriority="62" w:semiHidden="0" w:name="Light Grid Accent 6"/>
     <w:lsdException w:unhideWhenUsed="0" w:uiPriority="63" w:semiHidden="0" w:name="Medium Shading 1 Accent 6"/>
     <w:lsdException w:unhideWhenUsed="0" w:uiPriority="64" w:semiHidden="0" w:name="Medium Shading 2 Accent 6"/>
     <w:lsdException w:unhideWhenUsed="0" w:uiPriority="65" w:semiHidden="0" w:name="Medium List 1 Accent 6"/>
     <w:lsdException w:unhideWhenUsed="0" w:uiPriority="66" w:semiHidden="0" w:name="Medium List 2 Accent 6"/>
-    <w:lsdException w:unhideWhenUsed="0" w:uiPriority="67" w:semiHidden="0" w:name="Medium Grid 1 Accent 6"/>
+    <w:lsdException w:qFormat="1" w:unhideWhenUsed="0" w:uiPriority="67" w:semiHidden="0" w:name="Medium Grid 1 Accent 6"/>
     <w:lsdException w:unhideWhenUsed="0" w:uiPriority="68" w:semiHidden="0" w:name="Medium Grid 2 Accent 6"/>
     <w:lsdException w:unhideWhenUsed="0" w:uiPriority="69" w:semiHidden="0" w:name="Medium Grid 3 Accent 6"/>
-    <w:lsdException w:unhideWhenUsed="0" w:uiPriority="70" w:semiHidden="0" w:name="Dark List Accent 6"/>
+    <w:lsdException w:qFormat="1" w:unhideWhenUsed="0" w:uiPriority="70" w:semiHidden="0" w:name="Dark List Accent 6"/>
     <w:lsdException w:unhideWhenUsed="0" w:uiPriority="71" w:semiHidden="0" w:name="Colorful Shading Accent 6"/>
     <w:lsdException w:unhideWhenUsed="0" w:uiPriority="72" w:semiHidden="0" w:name="Colorful List Accent 6"/>
     <w:lsdException w:unhideWhenUsed="0" w:uiPriority="73" w:semiHidden="0" w:name="Colorful Grid Accent 6"/>
@@ -2349,12 +2830,14 @@
     <w:name w:val="Default Paragraph Font"/>
     <w:semiHidden/>
     <w:unhideWhenUsed/>
+    <w:qFormat/>
     <w:uiPriority w:val="1"/>
   </w:style>
   <w:style w:type="table" w:default="1" w:styleId="32">
     <w:name w:val="Normal Table"/>
     <w:semiHidden/>
     <w:unhideWhenUsed/>
+    <w:qFormat/>
     <w:uiPriority w:val="99"/>
     <w:tblPr>
       <w:tblCellMar>
@@ -2369,6 +2852,7 @@
     <w:name w:val="macro"/>
     <w:link w:val="147"/>
     <w:unhideWhenUsed/>
+    <w:qFormat/>
     <w:uiPriority w:val="99"/>
     <w:pPr>
       <w:tabs>
@@ -2404,6 +2888,7 @@
     <w:name w:val="List Number 2"/>
     <w:basedOn w:val="1"/>
     <w:unhideWhenUsed/>
+    <w:qFormat/>
     <w:uiPriority w:val="99"/>
     <w:pPr>
       <w:numPr>
@@ -2417,6 +2902,7 @@
     <w:name w:val="List Number"/>
     <w:basedOn w:val="1"/>
     <w:unhideWhenUsed/>
+    <w:qFormat/>
     <w:uiPriority w:val="99"/>
     <w:pPr>
       <w:numPr>
@@ -2454,6 +2940,7 @@
     <w:name w:val="List Bullet"/>
     <w:basedOn w:val="1"/>
     <w:unhideWhenUsed/>
+    <w:qFormat/>
     <w:uiPriority w:val="99"/>
     <w:pPr>
       <w:numPr>
@@ -2468,6 +2955,7 @@
     <w:basedOn w:val="1"/>
     <w:link w:val="146"/>
     <w:unhideWhenUsed/>
+    <w:qFormat/>
     <w:uiPriority w:val="99"/>
     <w:pPr>
       <w:spacing w:after="120"/>
@@ -2481,6 +2969,7 @@
     <w:name w:val="List Bullet 3"/>
     <w:basedOn w:val="1"/>
     <w:unhideWhenUsed/>
+    <w:qFormat/>
     <w:uiPriority w:val="99"/>
     <w:pPr>
       <w:numPr>
@@ -2505,6 +2994,7 @@
     <w:name w:val="List Number 3"/>
     <w:basedOn w:val="1"/>
     <w:unhideWhenUsed/>
+    <w:qFormat/>
     <w:uiPriority w:val="99"/>
     <w:pPr>
       <w:numPr>
@@ -2529,6 +3019,7 @@
     <w:name w:val="List Continue"/>
     <w:basedOn w:val="1"/>
     <w:unhideWhenUsed/>
+    <w:qFormat/>
     <w:uiPriority w:val="99"/>
     <w:pPr>
       <w:spacing w:after="120"/>
@@ -2618,6 +3109,7 @@
     <w:basedOn w:val="1"/>
     <w:link w:val="145"/>
     <w:unhideWhenUsed/>
+    <w:qFormat/>
     <w:uiPriority w:val="99"/>
     <w:pPr>
       <w:spacing w:after="120" w:line="480" w:lineRule="auto"/>
@@ -2994,6 +3486,7 @@
   <w:style w:type="table" w:styleId="37">
     <w:name w:val="Light Shading Accent 3"/>
     <w:basedOn w:val="32"/>
+    <w:qFormat/>
     <w:uiPriority w:val="60"/>
     <w:pPr>
       <w:spacing w:after="0" w:line="240" w:lineRule="auto"/>
@@ -3858,6 +4351,7 @@
   <w:style w:type="table" w:styleId="46">
     <w:name w:val="Light List Accent 5"/>
     <w:basedOn w:val="32"/>
+    <w:qFormat/>
     <w:uiPriority w:val="61"/>
     <w:pPr>
       <w:spacing w:after="0" w:line="240" w:lineRule="auto"/>
@@ -3951,6 +4445,7 @@
   <w:style w:type="table" w:styleId="47">
     <w:name w:val="Light List Accent 6"/>
     <w:basedOn w:val="32"/>
+    <w:qFormat/>
     <w:uiPriority w:val="61"/>
     <w:pPr>
       <w:spacing w:after="0" w:line="240" w:lineRule="auto"/>
@@ -4044,6 +4539,7 @@
   <w:style w:type="table" w:styleId="48">
     <w:name w:val="Light Grid"/>
     <w:basedOn w:val="32"/>
+    <w:qFormat/>
     <w:uiPriority w:val="62"/>
     <w:pPr>
       <w:spacing w:after="0" w:line="240" w:lineRule="auto"/>
@@ -8643,6 +9139,7 @@
   <w:style w:type="table" w:styleId="87">
     <w:name w:val="Medium Grid 1 Accent 4"/>
     <w:basedOn w:val="32"/>
+    <w:qFormat/>
     <w:uiPriority w:val="67"/>
     <w:pPr>
       <w:spacing w:after="0" w:line="240" w:lineRule="auto"/>
@@ -8781,6 +9278,7 @@
   <w:style w:type="table" w:styleId="89">
     <w:name w:val="Medium Grid 1 Accent 6"/>
     <w:basedOn w:val="32"/>
+    <w:qFormat/>
     <w:uiPriority w:val="67"/>
     <w:pPr>
       <w:spacing w:after="0" w:line="240" w:lineRule="auto"/>
@@ -11661,6 +12159,7 @@
   <w:style w:type="table" w:styleId="110">
     <w:name w:val="Dark List Accent 6"/>
     <w:basedOn w:val="32"/>
+    <w:qFormat/>
     <w:uiPriority w:val="70"/>
     <w:pPr>
       <w:spacing w:after="0" w:line="240" w:lineRule="auto"/>
@@ -11776,6 +12275,7 @@
   <w:style w:type="table" w:styleId="111">
     <w:name w:val="Colorful Shading"/>
     <w:basedOn w:val="32"/>
+    <w:qFormat/>
     <w:uiPriority w:val="71"/>
     <w:pPr>
       <w:spacing w:after="0" w:line="240" w:lineRule="auto"/>
@@ -12496,6 +12996,7 @@
   <w:style w:type="table" w:styleId="116">
     <w:name w:val="Colorful Shading Accent 5"/>
     <w:basedOn w:val="32"/>
+    <w:qFormat/>
     <w:uiPriority w:val="71"/>
     <w:pPr>
       <w:spacing w:after="0" w:line="240" w:lineRule="auto"/>
@@ -14337,6 +14838,7 @@
     <w:basedOn w:val="132"/>
     <w:link w:val="7"/>
     <w:semiHidden/>
+    <w:qFormat/>
     <w:uiPriority w:val="9"/>
     <w:rPr>
       <w:rFonts w:asciiTheme="majorHAnsi" w:hAnsiTheme="majorHAnsi" w:eastAsiaTheme="majorEastAsia" w:cstheme="majorBidi"/>
@@ -14348,6 +14850,7 @@
     <w:basedOn w:val="132"/>
     <w:link w:val="8"/>
     <w:semiHidden/>
+    <w:qFormat/>
     <w:uiPriority w:val="9"/>
     <w:rPr>
       <w:rFonts w:asciiTheme="majorHAnsi" w:hAnsiTheme="majorHAnsi" w:eastAsiaTheme="majorEastAsia" w:cstheme="majorBidi"/>
@@ -14361,6 +14864,7 @@
     <w:basedOn w:val="132"/>
     <w:link w:val="9"/>
     <w:semiHidden/>
+    <w:qFormat/>
     <w:uiPriority w:val="9"/>
     <w:rPr>
       <w:rFonts w:asciiTheme="majorHAnsi" w:hAnsiTheme="majorHAnsi" w:eastAsiaTheme="majorEastAsia" w:cstheme="majorBidi"/>
@@ -14382,6 +14886,7 @@
     <w:basedOn w:val="132"/>
     <w:link w:val="10"/>
     <w:semiHidden/>
+    <w:qFormat/>
     <w:uiPriority w:val="9"/>
     <w:rPr>
       <w:rFonts w:asciiTheme="majorHAnsi" w:hAnsiTheme="majorHAnsi" w:eastAsiaTheme="majorEastAsia" w:cstheme="majorBidi"/>
@@ -14400,6 +14905,7 @@
     <w:basedOn w:val="132"/>
     <w:link w:val="11"/>
     <w:semiHidden/>
+    <w:qFormat/>
     <w:uiPriority w:val="9"/>
     <w:rPr>
       <w:rFonts w:asciiTheme="majorHAnsi" w:hAnsiTheme="majorHAnsi" w:eastAsiaTheme="majorEastAsia" w:cstheme="majorBidi"/>
@@ -14449,6 +14955,7 @@
     <w:name w:val="Intense Quote Char"/>
     <w:basedOn w:val="132"/>
     <w:link w:val="156"/>
+    <w:qFormat/>
     <w:uiPriority w:val="30"/>
     <w:rPr>
       <w:b/>

</xml_diff>